<commit_message>
Part 1 changes and edits to match workflow and code
</commit_message>
<xml_diff>
--- a/docs/RaceDay_Planning_Part1.docx
+++ b/docs/RaceDay_Planning_Part1.docx
@@ -385,7 +385,7 @@
                 <w:sz w:val="19"/>
                 <w:szCs w:val="19"/>
               </w:rPr>
-              <w:t xml:space="preserve">{ fullName, email, password, role }</w:t>
+              <w:t xml:space="preserve">{ fullName, email, password, role, organisationName (Organiser), dateOfBirth (Participant) }</w:t>
             </w:r>
           </w:p>
         </w:tc>
@@ -463,7 +463,7 @@
                 <w:sz w:val="19"/>
                 <w:szCs w:val="19"/>
               </w:rPr>
-              <w:t xml:space="preserve">Authenticates a user and returns an access token.</w:t>
+              <w:t xml:space="preserve">Authenticates a user and creates a server-side session (session cookie) that stores the user ID and role.</w:t>
             </w:r>
           </w:p>
         </w:tc>
@@ -520,7 +520,7 @@
                 <w:sz w:val="19"/>
                 <w:szCs w:val="19"/>
               </w:rPr>
-              <w:t xml:space="preserve">200 OK - { token, user } 401 Unauthorized - invalid credentials</w:t>
+              <w:t xml:space="preserve">200 OK - { message, user } and session cookie set 401 Unauthorized - invalid credentials</w:t>
             </w:r>
           </w:p>
         </w:tc>
@@ -541,7 +541,7 @@
                 <w:sz w:val="19"/>
                 <w:szCs w:val="19"/>
               </w:rPr>
-              <w:t xml:space="preserve">GET</w:t>
+              <w:t xml:space="preserve">POST</w:t>
             </w:r>
           </w:p>
         </w:tc>
@@ -560,7 +560,7 @@
                 <w:sz w:val="19"/>
                 <w:szCs w:val="19"/>
               </w:rPr>
-              <w:t xml:space="preserve">/api/users/me</w:t>
+              <w:t xml:space="preserve">/api/auth/logout</w:t>
             </w:r>
           </w:p>
         </w:tc>
@@ -579,7 +579,7 @@
                 <w:sz w:val="19"/>
                 <w:szCs w:val="19"/>
               </w:rPr>
-              <w:t xml:space="preserve">Returns the profile of the currently logged-in user.</w:t>
+              <w:t xml:space="preserve">Logs out the current user and destroys the server-side session.</w:t>
             </w:r>
           </w:p>
         </w:tc>
@@ -598,7 +598,7 @@
                 <w:sz w:val="19"/>
                 <w:szCs w:val="19"/>
               </w:rPr>
-              <w:t xml:space="preserve">Any (logged in)</w:t>
+              <w:t xml:space="preserve">None (public)</w:t>
             </w:r>
           </w:p>
         </w:tc>
@@ -636,7 +636,7 @@
                 <w:sz w:val="19"/>
                 <w:szCs w:val="19"/>
               </w:rPr>
-              <w:t xml:space="preserve">200 OK - user profile object 401 Unauthorized - no/invalid token</w:t>
+              <w:t xml:space="preserve">204 No Content</w:t>
             </w:r>
           </w:p>
         </w:tc>
@@ -657,7 +657,7 @@
                 <w:sz w:val="19"/>
                 <w:szCs w:val="19"/>
               </w:rPr>
-              <w:t xml:space="preserve">PUT</w:t>
+              <w:t xml:space="preserve">GET</w:t>
             </w:r>
           </w:p>
         </w:tc>
@@ -695,7 +695,7 @@
                 <w:sz w:val="19"/>
                 <w:szCs w:val="19"/>
               </w:rPr>
-              <w:t xml:space="preserve">Updates the profile of the currently logged-in user.</w:t>
+              <w:t xml:space="preserve">Returns the profile of the currently logged-in user.</w:t>
             </w:r>
           </w:p>
         </w:tc>
@@ -733,7 +733,7 @@
                 <w:sz w:val="19"/>
                 <w:szCs w:val="19"/>
               </w:rPr>
-              <w:t xml:space="preserve">{ fullName, contactPhone, ... }</w:t>
+              <w:t xml:space="preserve">None</w:t>
             </w:r>
           </w:p>
         </w:tc>
@@ -752,7 +752,7 @@
                 <w:sz w:val="19"/>
                 <w:szCs w:val="19"/>
               </w:rPr>
-              <w:t xml:space="preserve">200 OK - updated user object 400 Bad Request - validation error</w:t>
+              <w:t xml:space="preserve">200 OK - user profile object 401 Unauthorized - not logged in (no active session)</w:t>
             </w:r>
           </w:p>
         </w:tc>
@@ -773,7 +773,7 @@
                 <w:sz w:val="19"/>
                 <w:szCs w:val="19"/>
               </w:rPr>
-              <w:t xml:space="preserve">DELETE</w:t>
+              <w:t xml:space="preserve">PUT</w:t>
             </w:r>
           </w:p>
         </w:tc>
@@ -811,7 +811,7 @@
                 <w:sz w:val="19"/>
                 <w:szCs w:val="19"/>
               </w:rPr>
-              <w:t xml:space="preserve">Deactivates/deletes the currently logged-in user's account.</w:t>
+              <w:t xml:space="preserve">Updates the profile of the currently logged-in user.</w:t>
             </w:r>
           </w:p>
         </w:tc>
@@ -849,7 +849,7 @@
                 <w:sz w:val="19"/>
                 <w:szCs w:val="19"/>
               </w:rPr>
-              <w:t xml:space="preserve">None</w:t>
+              <w:t xml:space="preserve">{ fullName, contactPhone, ... }</w:t>
             </w:r>
           </w:p>
         </w:tc>
@@ -868,7 +868,7 @@
                 <w:sz w:val="19"/>
                 <w:szCs w:val="19"/>
               </w:rPr>
-              <w:t xml:space="preserve">204 No Content 401 Unauthorized</w:t>
+              <w:t xml:space="preserve">200 OK - updated user object 400 Bad Request - validation error</w:t>
             </w:r>
           </w:p>
         </w:tc>
@@ -889,7 +889,7 @@
                 <w:sz w:val="19"/>
                 <w:szCs w:val="19"/>
               </w:rPr>
-              <w:t xml:space="preserve">GET</w:t>
+              <w:t xml:space="preserve">DELETE</w:t>
             </w:r>
           </w:p>
         </w:tc>
@@ -908,7 +908,7 @@
                 <w:sz w:val="19"/>
                 <w:szCs w:val="19"/>
               </w:rPr>
-              <w:t xml:space="preserve">/api/events</w:t>
+              <w:t xml:space="preserve">/api/users/me</w:t>
             </w:r>
           </w:p>
         </w:tc>
@@ -927,7 +927,7 @@
                 <w:sz w:val="19"/>
                 <w:szCs w:val="19"/>
               </w:rPr>
-              <w:t xml:space="preserve">Lists all published events. Supports filtering/search.</w:t>
+              <w:t xml:space="preserve">Deactivates/deletes the currently logged-in user's account.</w:t>
             </w:r>
           </w:p>
         </w:tc>
@@ -946,7 +946,7 @@
                 <w:sz w:val="19"/>
                 <w:szCs w:val="19"/>
               </w:rPr>
-              <w:t xml:space="preserve">None (public)</w:t>
+              <w:t xml:space="preserve">Any (logged in)</w:t>
             </w:r>
           </w:p>
         </w:tc>
@@ -984,7 +984,7 @@
                 <w:sz w:val="19"/>
                 <w:szCs w:val="19"/>
               </w:rPr>
-              <w:t xml:space="preserve">200 OK - array of event objects</w:t>
+              <w:t xml:space="preserve">204 No Content 401 Unauthorized</w:t>
             </w:r>
           </w:p>
         </w:tc>
@@ -1024,7 +1024,7 @@
                 <w:sz w:val="19"/>
                 <w:szCs w:val="19"/>
               </w:rPr>
-              <w:t xml:space="preserve">/api/events/{id}</w:t>
+              <w:t xml:space="preserve">/api/events</w:t>
             </w:r>
           </w:p>
         </w:tc>
@@ -1043,7 +1043,7 @@
                 <w:sz w:val="19"/>
                 <w:szCs w:val="19"/>
               </w:rPr>
-              <w:t xml:space="preserve">Retrieves full details for a single event, including its categories.</w:t>
+              <w:t xml:space="preserve">Lists all published events. Supports filtering/search.</w:t>
             </w:r>
           </w:p>
         </w:tc>
@@ -1100,7 +1100,7 @@
                 <w:sz w:val="19"/>
                 <w:szCs w:val="19"/>
               </w:rPr>
-              <w:t xml:space="preserve">200 OK - event object 404 Not Found - event does not exist</w:t>
+              <w:t xml:space="preserve">200 OK - array of event objects</w:t>
             </w:r>
           </w:p>
         </w:tc>
@@ -1121,7 +1121,7 @@
                 <w:sz w:val="19"/>
                 <w:szCs w:val="19"/>
               </w:rPr>
-              <w:t xml:space="preserve">POST</w:t>
+              <w:t xml:space="preserve">GET</w:t>
             </w:r>
           </w:p>
         </w:tc>
@@ -1140,7 +1140,7 @@
                 <w:sz w:val="19"/>
                 <w:szCs w:val="19"/>
               </w:rPr>
-              <w:t xml:space="preserve">/api/events</w:t>
+              <w:t xml:space="preserve">/api/events/{id}</w:t>
             </w:r>
           </w:p>
         </w:tc>
@@ -1159,7 +1159,7 @@
                 <w:sz w:val="19"/>
                 <w:szCs w:val="19"/>
               </w:rPr>
-              <w:t xml:space="preserve">Creates a new event owned by the logged-in organiser.</w:t>
+              <w:t xml:space="preserve">Retrieves full details for a single event, including its categories.</w:t>
             </w:r>
           </w:p>
         </w:tc>
@@ -1178,7 +1178,7 @@
                 <w:sz w:val="19"/>
                 <w:szCs w:val="19"/>
               </w:rPr>
-              <w:t xml:space="preserve">Organiser</w:t>
+              <w:t xml:space="preserve">None (public)</w:t>
             </w:r>
           </w:p>
         </w:tc>
@@ -1197,7 +1197,7 @@
                 <w:sz w:val="19"/>
                 <w:szCs w:val="19"/>
               </w:rPr>
-              <w:t xml:space="preserve">{ name, eventDate, location, description }</w:t>
+              <w:t xml:space="preserve">None</w:t>
             </w:r>
           </w:p>
         </w:tc>
@@ -1216,7 +1216,7 @@
                 <w:sz w:val="19"/>
                 <w:szCs w:val="19"/>
               </w:rPr>
-              <w:t xml:space="preserve">201 Created - event object 400 Bad Request - validation error 403 Forbidden - not an organiser</w:t>
+              <w:t xml:space="preserve">200 OK - event object 404 Not Found - event does not exist</w:t>
             </w:r>
           </w:p>
         </w:tc>
@@ -1237,6 +1237,238 @@
                 <w:sz w:val="19"/>
                 <w:szCs w:val="19"/>
               </w:rPr>
+              <w:t xml:space="preserve">GET</w:t>
+            </w:r>
+          </w:p>
+        </w:tc>
+        <w:tc>
+          <w:tcPr>
+            <w:tcW w:type="dxa" w:w="2300"/>
+            <w:vAlign w:val="center"/>
+          </w:tcPr>
+          <w:p>
+            <w:r>
+              <w:rPr>
+                <w:b w:val="false"/>
+                <w:bCs w:val="false"/>
+                <w:i w:val="false"/>
+                <w:iCs w:val="false"/>
+                <w:sz w:val="19"/>
+                <w:szCs w:val="19"/>
+              </w:rPr>
+              <w:t xml:space="preserve">/api/events/mine</w:t>
+            </w:r>
+          </w:p>
+        </w:tc>
+        <w:tc>
+          <w:tcPr>
+            <w:tcW w:type="dxa" w:w="3000"/>
+            <w:vAlign w:val="center"/>
+          </w:tcPr>
+          <w:p>
+            <w:r>
+              <w:rPr>
+                <w:b w:val="false"/>
+                <w:bCs w:val="false"/>
+                <w:i w:val="false"/>
+                <w:iCs w:val="false"/>
+                <w:sz w:val="19"/>
+                <w:szCs w:val="19"/>
+              </w:rPr>
+              <w:t xml:space="preserve">Lists all events (any status, including drafts) owned by the logged-in organiser.</w:t>
+            </w:r>
+          </w:p>
+        </w:tc>
+        <w:tc>
+          <w:tcPr>
+            <w:tcW w:type="dxa" w:w="1500"/>
+            <w:vAlign w:val="center"/>
+          </w:tcPr>
+          <w:p>
+            <w:r>
+              <w:rPr>
+                <w:b w:val="false"/>
+                <w:bCs w:val="false"/>
+                <w:i w:val="false"/>
+                <w:iCs w:val="false"/>
+                <w:sz w:val="19"/>
+                <w:szCs w:val="19"/>
+              </w:rPr>
+              <w:t xml:space="preserve">Organiser</w:t>
+            </w:r>
+          </w:p>
+        </w:tc>
+        <w:tc>
+          <w:tcPr>
+            <w:tcW w:type="dxa" w:w="2400"/>
+            <w:vAlign w:val="center"/>
+          </w:tcPr>
+          <w:p>
+            <w:r>
+              <w:rPr>
+                <w:b w:val="false"/>
+                <w:bCs w:val="false"/>
+                <w:i w:val="false"/>
+                <w:iCs w:val="false"/>
+                <w:sz w:val="19"/>
+                <w:szCs w:val="19"/>
+              </w:rPr>
+              <w:t xml:space="preserve">None</w:t>
+            </w:r>
+          </w:p>
+        </w:tc>
+        <w:tc>
+          <w:tcPr>
+            <w:tcW w:type="dxa" w:w="2500"/>
+            <w:vAlign w:val="center"/>
+          </w:tcPr>
+          <w:p>
+            <w:r>
+              <w:rPr>
+                <w:b w:val="false"/>
+                <w:bCs w:val="false"/>
+                <w:i w:val="false"/>
+                <w:iCs w:val="false"/>
+                <w:sz w:val="19"/>
+                <w:szCs w:val="19"/>
+              </w:rPr>
+              <w:t xml:space="preserve">200 OK - array of event objects 401 Unauthorized 403 Forbidden - not an organiser</w:t>
+            </w:r>
+          </w:p>
+        </w:tc>
+      </w:tr>
+      <w:tr>
+        <w:tc>
+          <w:tcPr>
+            <w:tcW w:type="dxa" w:w="1300"/>
+            <w:vAlign w:val="center"/>
+          </w:tcPr>
+          <w:p>
+            <w:r>
+              <w:rPr>
+                <w:b/>
+                <w:bCs/>
+                <w:i w:val="false"/>
+                <w:iCs w:val="false"/>
+                <w:sz w:val="19"/>
+                <w:szCs w:val="19"/>
+              </w:rPr>
+              <w:t xml:space="preserve">POST</w:t>
+            </w:r>
+          </w:p>
+        </w:tc>
+        <w:tc>
+          <w:tcPr>
+            <w:tcW w:type="dxa" w:w="2300"/>
+            <w:vAlign w:val="center"/>
+          </w:tcPr>
+          <w:p>
+            <w:r>
+              <w:rPr>
+                <w:b w:val="false"/>
+                <w:bCs w:val="false"/>
+                <w:i w:val="false"/>
+                <w:iCs w:val="false"/>
+                <w:sz w:val="19"/>
+                <w:szCs w:val="19"/>
+              </w:rPr>
+              <w:t xml:space="preserve">/api/events</w:t>
+            </w:r>
+          </w:p>
+        </w:tc>
+        <w:tc>
+          <w:tcPr>
+            <w:tcW w:type="dxa" w:w="3000"/>
+            <w:vAlign w:val="center"/>
+          </w:tcPr>
+          <w:p>
+            <w:r>
+              <w:rPr>
+                <w:b w:val="false"/>
+                <w:bCs w:val="false"/>
+                <w:i w:val="false"/>
+                <w:iCs w:val="false"/>
+                <w:sz w:val="19"/>
+                <w:szCs w:val="19"/>
+              </w:rPr>
+              <w:t xml:space="preserve">Creates a new event (name, description, date, location, distance and type) owned by the logged-in organiser.</w:t>
+            </w:r>
+          </w:p>
+        </w:tc>
+        <w:tc>
+          <w:tcPr>
+            <w:tcW w:type="dxa" w:w="1500"/>
+            <w:vAlign w:val="center"/>
+          </w:tcPr>
+          <w:p>
+            <w:r>
+              <w:rPr>
+                <w:b w:val="false"/>
+                <w:bCs w:val="false"/>
+                <w:i w:val="false"/>
+                <w:iCs w:val="false"/>
+                <w:sz w:val="19"/>
+                <w:szCs w:val="19"/>
+              </w:rPr>
+              <w:t xml:space="preserve">Organiser</w:t>
+            </w:r>
+          </w:p>
+        </w:tc>
+        <w:tc>
+          <w:tcPr>
+            <w:tcW w:type="dxa" w:w="2400"/>
+            <w:vAlign w:val="center"/>
+          </w:tcPr>
+          <w:p>
+            <w:r>
+              <w:rPr>
+                <w:b w:val="false"/>
+                <w:bCs w:val="false"/>
+                <w:i w:val="false"/>
+                <w:iCs w:val="false"/>
+                <w:sz w:val="19"/>
+                <w:szCs w:val="19"/>
+              </w:rPr>
+              <w:t xml:space="preserve">{ name, eventDate, location, description, distanceKm, eventType (run | walk | cycle), status }</w:t>
+            </w:r>
+          </w:p>
+        </w:tc>
+        <w:tc>
+          <w:tcPr>
+            <w:tcW w:type="dxa" w:w="2500"/>
+            <w:vAlign w:val="center"/>
+          </w:tcPr>
+          <w:p>
+            <w:r>
+              <w:rPr>
+                <w:b w:val="false"/>
+                <w:bCs w:val="false"/>
+                <w:i w:val="false"/>
+                <w:iCs w:val="false"/>
+                <w:sz w:val="19"/>
+                <w:szCs w:val="19"/>
+              </w:rPr>
+              <w:t xml:space="preserve">201 Created - event object 400 Bad Request - validation error 403 Forbidden - not an organiser</w:t>
+            </w:r>
+          </w:p>
+        </w:tc>
+      </w:tr>
+      <w:tr>
+        <w:tc>
+          <w:tcPr>
+            <w:tcW w:type="dxa" w:w="1300"/>
+            <w:vAlign w:val="center"/>
+          </w:tcPr>
+          <w:p>
+            <w:r>
+              <w:rPr>
+                <w:b/>
+                <w:bCs/>
+                <w:i w:val="false"/>
+                <w:iCs w:val="false"/>
+                <w:sz w:val="19"/>
+                <w:szCs w:val="19"/>
+              </w:rPr>
               <w:t xml:space="preserve">PUT</w:t>
             </w:r>
           </w:p>
@@ -1313,7 +1545,7 @@
                 <w:sz w:val="19"/>
                 <w:szCs w:val="19"/>
               </w:rPr>
-              <w:t xml:space="preserve">{ name, eventDate, location, description, status }</w:t>
+              <w:t xml:space="preserve">{ name, eventDate, location, description, distanceKm, eventType (run | walk | cycle), status }</w:t>
             </w:r>
           </w:p>
         </w:tc>
@@ -2743,6 +2975,92 @@
           <w:szCs w:val="18"/>
         </w:rPr>
         <w:t xml:space="preserve">Roles: "None (public)" = no authentication required. "Any (logged in)" = any authenticated user. "Organiser (owner)" / "Participant (owner)" = the authenticated user must own the related resource.</w:t>
+      </w:r>
+    </w:p>
+    <w:p>
+      <w:pPr>
+        <w:pStyle w:val="Heading1"/>
+        <w:spacing w:after="150" w:before="300"/>
+      </w:pPr>
+      <w:r>
+        <w:rPr>
+          <w:b/>
+          <w:bCs/>
+          <w:color w:val="1F4E79"/>
+        </w:rPr>
+        <w:t xml:space="preserve">Section C - Part 2 Updates to this Plan</w:t>
+      </w:r>
+    </w:p>
+    <w:p>
+      <w:pPr>
+        <w:spacing w:after="200"/>
+      </w:pPr>
+      <w:r>
+        <w:rPr>
+          <w:sz w:val="21"/>
+          <w:szCs w:val="21"/>
+        </w:rPr>
+        <w:t xml:space="preserve">While building the API in Part 2 the plan above was updated in the following ways so that it matches the implemented system and the Part 2 requirements:</w:t>
+      </w:r>
+    </w:p>
+    <w:p>
+      <w:pPr>
+        <w:spacing w:after="200"/>
+      </w:pPr>
+      <w:r>
+        <w:rPr>
+          <w:sz w:val="21"/>
+          <w:szCs w:val="21"/>
+        </w:rPr>
+        <w:t xml:space="preserve">1. Events now store distance and event type. The Events entity has two additional attributes: DistanceKM (decimal, overall event distance) and EventType (run, walk or cycle, enforced with a CHECK constraint). The SQL change is in Part2-API/Database/part2_schema_changes.sql. The ERD diagram (erd.png and the diagram in Section A) has been updated to show both attributes.</w:t>
+      </w:r>
+    </w:p>
+    <w:p>
+      <w:pPr>
+        <w:spacing w:after="200"/>
+      </w:pPr>
+      <w:r>
+        <w:rPr>
+          <w:sz w:val="21"/>
+          <w:szCs w:val="21"/>
+        </w:rPr>
+        <w:t xml:space="preserve">2. Authentication uses server-side sessions. POST /api/auth/login verifies the password hash and creates a session that stores the user ID, role and profile ID; the browser only holds a session cookie. Passwords are stored as PBKDF2 hashes, never in plain text. The earlier token-based response was replaced, and POST /api/auth/logout was added to destroy the session.</w:t>
+      </w:r>
+    </w:p>
+    <w:p>
+      <w:pPr>
+        <w:spacing w:after="200"/>
+      </w:pPr>
+      <w:r>
+        <w:rPr>
+          <w:sz w:val="21"/>
+          <w:szCs w:val="21"/>
+        </w:rPr>
+        <w:t xml:space="preserve">3. Registration and roles. Organisers must supply an organisation name and Participants a date of birth. An optional organiser registration code (configuration setting) can be required so that the Organiser role cannot simply be self-assigned. Protected endpoints return 401 when there is no session and 403 when the role is wrong or the resource belongs to another user.</w:t>
+      </w:r>
+    </w:p>
+    <w:p>
+      <w:pPr>
+        <w:spacing w:after="200"/>
+      </w:pPr>
+      <w:r>
+        <w:rPr>
+          <w:sz w:val="21"/>
+          <w:szCs w:val="21"/>
+        </w:rPr>
+        <w:t xml:space="preserve">4. New endpoint: GET /api/events/mine lists all events (including drafts) belonging to the logged-in organiser, since GET /api/events only returns published events.</w:t>
+      </w:r>
+    </w:p>
+    <w:p>
+      <w:pPr>
+        <w:spacing w:after="200"/>
+      </w:pPr>
+      <w:r>
+        <w:rPr>
+          <w:sz w:val="21"/>
+          <w:szCs w:val="21"/>
+        </w:rPr>
+        <w:t xml:space="preserve">5. Deleting an event that already has enrolments marks it as cancelled instead of removing it, so enrolment and result history is preserved.</w:t>
       </w:r>
     </w:p>
     <w:sectPr>

</xml_diff>